<commit_message>
23 and 27 updated
</commit_message>
<xml_diff>
--- a/quizzes/Quiz_24.docx
+++ b/quizzes/Quiz_24.docx
@@ -6,11 +6,13 @@
       <w:pPr>
         <w:rPr>
           <w:b w:val="1"/>
+          <w:bCs w:val="1"/>
         </w:rPr>
       </w:pPr>
       <w:r>
         <w:rPr>
           <w:b w:val="1"/>
+          <w:bCs w:val="1"/>
           <w:rtl w:val="0"/>
         </w:rPr>
         <w:t xml:space="preserve">Quiz 24</w:t>
@@ -149,6 +151,7 @@
         <w:ind w:left="720" w:firstLine="0"/>
         <w:rPr>
           <w:i w:val="1"/>
+          <w:iCs w:val="1"/>
           <w:sz w:val="28"/>
           <w:szCs w:val="28"/>
         </w:rPr>
@@ -156,6 +159,7 @@
       <w:r>
         <w:rPr>
           <w:i w:val="1"/>
+          <w:iCs w:val="1"/>
           <w:sz w:val="28"/>
           <w:szCs w:val="28"/>
           <w:rtl w:val="0"/>
@@ -173,6 +177,7 @@
       <w:r>
         <w:rPr>
           <w:i w:val="1"/>
+          <w:iCs w:val="1"/>
           <w:sz w:val="28"/>
           <w:szCs w:val="28"/>
           <w:rtl w:val="0"/>
@@ -205,6 +210,7 @@
       <w:r>
         <w:rPr>
           <w:i w:val="1"/>
+          <w:iCs w:val="1"/>
           <w:rtl w:val="0"/>
         </w:rPr>
         <w:t xml:space="preserve">P</w:t>
@@ -218,6 +224,7 @@
       <w:r>
         <w:rPr>
           <w:i w:val="1"/>
+          <w:iCs w:val="1"/>
           <w:rtl w:val="0"/>
         </w:rPr>
         <w:t xml:space="preserve">m</w:t>
@@ -231,6 +238,7 @@
       <w:r>
         <w:rPr>
           <w:i w:val="1"/>
+          <w:iCs w:val="1"/>
           <w:rtl w:val="0"/>
         </w:rPr>
         <w:t xml:space="preserve">c</w:t>
@@ -577,11 +585,19 @@
       </w:pPr>
     </w:pPrDefault>
   </w:docDefaults>
+  <w:style w:type="table" w:styleId="TableNormal" w:default="1">
+    <w:name w:val="TableNormal"/>
+    <w:tblPr>
+      <w:tblCellMar>
+        <w:top w:w="100.0" w:type="dxa"/>
+        <w:left w:w="100.0" w:type="dxa"/>
+        <w:bottom w:w="100.0" w:type="dxa"/>
+        <w:right w:w="100.0" w:type="dxa"/>
+      </w:tblCellMar>
+    </w:tblPr>
+  </w:style>
   <w:style w:type="paragraph" w:styleId="Normal" w:default="1">
     <w:name w:val="normal"/>
-  </w:style>
-  <w:style w:type="table" w:styleId="TableNormal" w:default="1">
-    <w:name w:val="Table Normal"/>
   </w:style>
   <w:style w:type="paragraph" w:styleId="Heading1">
     <w:name w:val="heading 1"/>
@@ -610,6 +626,7 @@
     </w:pPr>
     <w:rPr>
       <w:b w:val="0"/>
+      <w:bCs w:val="0"/>
       <w:sz w:val="32"/>
       <w:szCs w:val="32"/>
     </w:rPr>
@@ -626,6 +643,7 @@
     </w:pPr>
     <w:rPr>
       <w:b w:val="0"/>
+      <w:bCs w:val="0"/>
       <w:color w:val="434343"/>
       <w:sz w:val="28"/>
       <w:szCs w:val="28"/>
@@ -675,6 +693,7 @@
     </w:pPr>
     <w:rPr>
       <w:i w:val="1"/>
+      <w:iCs w:val="1"/>
       <w:color w:val="666666"/>
       <w:sz w:val="22"/>
       <w:szCs w:val="22"/>
@@ -708,6 +727,7 @@
     <w:rPr>
       <w:rFonts w:ascii="Arial" w:cs="Arial" w:eastAsia="Arial" w:hAnsi="Arial"/>
       <w:i w:val="0"/>
+      <w:iCs w:val="0"/>
       <w:color w:val="666666"/>
       <w:sz w:val="30"/>
       <w:szCs w:val="30"/>

</xml_diff>